<commit_message>
feat: configurable tolerance + About dialog cleanup
허용오차 설정 기능:
- GUI '교정 설정' 섹션에 '허용오차(Ω)' 입력 필드 추가
- 센서 변경 시 자동입력 (PT100: 0.385Ω, PT1000: 3.85Ω, Strain350: 1.35Ω)
- 사용자가 직접 수정 가능 (예: Strain350에서 0.5Ω 등)
- 캘리브레이션, xlsx/docx/pdf 출력 모두 GUI 설정값 반영
- PASS/FAIL 판정 및 허용오차 표시선이 설정값 기준으로 동작

About 다이얼로그 간소화:
- 센서 타입 목록 및 채널 수 행 제거
- 버전, 빌드 날짜, 저작권(© 2026 DANAM Systems Inc.)만 표시
- 저작권 텍스트 강조 (bold, 네이비 계열)

Co-Authored-By: Claude Sonnet 4.6 <noreply@anthropic.com>
</commit_message>
<xml_diff>
--- a/reference/Calibration sheet template.docx
+++ b/reference/Calibration sheet template.docx
@@ -49,14 +49,12 @@
             <w:pPr>
               <w:pStyle w:val="a3"/>
             </w:pPr>
-            <w:bookmarkStart w:id="0" w:name="_top"/>
-            <w:bookmarkEnd w:id="0"/>
             <w:r>
               <w:rPr>
                 <w:rFonts w:ascii="나눔스퀘어 ExtraBold"/>
                 <w:sz w:val="40"/>
               </w:rPr>
-              <w:t>Test Report</w:t>
+              <w:t>SCDAU Calibration Sheet</w:t>
             </w:r>
           </w:p>
         </w:tc>
@@ -144,7 +142,13 @@
               <w:rPr>
                 <w:rFonts w:ascii="KoPub돋움체 Medium"/>
               </w:rPr>
-              <w:t xml:space="preserve">Certificate </w:t>
+              <w:t>Document</w:t>
+            </w:r>
+            <w:r>
+              <w:rPr>
+                <w:rFonts w:ascii="KoPub돋움체 Medium"/>
+              </w:rPr>
+              <w:t xml:space="preserve"> </w:t>
             </w:r>
             <w:proofErr w:type="gramStart"/>
             <w:r>
@@ -158,7 +162,7 @@
               <w:rPr>
                 <w:rFonts w:ascii="KoPub돋움체 Medium"/>
               </w:rPr>
-              <w:t xml:space="preserve"> DA-AE-OTR-2501</w:t>
+              <w:t xml:space="preserve"> </w:t>
             </w:r>
           </w:p>
         </w:tc>
@@ -3474,9 +3478,6 @@
     <w:p>
       <w:pPr>
         <w:pStyle w:val="a3"/>
-        <w:rPr>
-          <w:rFonts w:hint="eastAsia"/>
-        </w:rPr>
       </w:pPr>
     </w:p>
     <w:sectPr>

</xml_diff>